<commit_message>
Add Venezuela, Cuba and Nicaragua diaspora and democracy section
Lists confirmed organizations with context, missions and sector links;
updates Nicaragua entries for COSEP and AmCham closures.

Co-Authored-By: Claude Opus 5.5 <noreply@anthropic.com>
Claude-Session: https://claude.ai/code/session_01CvseaSPRyEaZ9dk2EN4SFT
</commit_message>
<xml_diff>
--- a/LAC_Anchor_Business_Associations.docx
+++ b/LAC_Anchor_Business_Associations.docx
@@ -4063,7 +4063,7 @@
                 <w:sz w:val="17"/>
                 <w:szCs w:val="17"/>
               </w:rPr>
-              <w:t xml:space="preserve">Former peak private-sector council; I believe the government shut it down in 2023 (verify).</w:t>
+              <w:t xml:space="preserve">Former peak private-sector council. Broke with Ortega in 2018; the government cancelled its legal status, and that of 18 other chambers, in March 2023. Former leaders are in exile.</w:t>
             </w:r>
           </w:p>
         </w:tc>
@@ -4087,7 +4087,7 @@
                 <w:sz w:val="17"/>
                 <w:szCs w:val="17"/>
               </w:rPr>
-              <w:t xml:space="preserve">Limited engagement potential; check status.</w:t>
+              <w:t xml:space="preserve">No formal engagement possible inside Nicaragua; former leaders are potential connectors (see Diaspora section).</w:t>
             </w:r>
           </w:p>
         </w:tc>
@@ -4111,7 +4111,7 @@
                 <w:sz w:val="17"/>
                 <w:szCs w:val="17"/>
               </w:rPr>
-              <w:t xml:space="preserve">✅ / ❓</w:t>
+              <w:t xml:space="preserve">✅</w:t>
             </w:r>
           </w:p>
         </w:tc>
@@ -4203,7 +4203,7 @@
                 <w:sz w:val="17"/>
                 <w:szCs w:val="17"/>
               </w:rPr>
-              <w:t xml:space="preserve"> exports.</w:t>
+              <w:t xml:space="preserve"> exports. Check current status given the closures.</w:t>
             </w:r>
           </w:p>
         </w:tc>
@@ -4283,7 +4283,7 @@
                 <w:sz w:val="17"/>
                 <w:szCs w:val="17"/>
               </w:rPr>
-              <w:t xml:space="preserve">American Chamber of Commerce.</w:t>
+              <w:t xml:space="preserve">American Chamber of Commerce (founded 1974; 300+ members). Closed by the government in 2024, along with 150 other chambers.</w:t>
             </w:r>
           </w:p>
         </w:tc>
@@ -4307,7 +4307,7 @@
                 <w:sz w:val="17"/>
                 <w:szCs w:val="17"/>
               </w:rPr>
-              <w:t xml:space="preserve">Link to U.S. companies.</w:t>
+              <w:t xml:space="preserve">No longer operating in Nicaragua.</w:t>
             </w:r>
           </w:p>
         </w:tc>
@@ -4331,7 +4331,7 @@
                 <w:sz w:val="17"/>
                 <w:szCs w:val="17"/>
               </w:rPr>
-              <w:t xml:space="preserve">❓</w:t>
+              <w:t xml:space="preserve">✅</w:t>
             </w:r>
           </w:p>
         </w:tc>
@@ -12197,6 +12197,1508 @@
                 <w:szCs w:val="17"/>
               </w:rPr>
               <w:t xml:space="preserve">✅</w:t>
+            </w:r>
+          </w:p>
+        </w:tc>
+      </w:tr>
+    </w:tbl>
+    <w:p>
+      <w:pPr>
+        <w:pStyle w:val="Heading1"/>
+        <w:keepNext/>
+        <w:spacing w:after="80" w:before="240"/>
+      </w:pPr>
+      <w:r>
+        <w:rPr>
+          <w:rFonts w:ascii="Calibri" w:cs="Calibri" w:eastAsia="Calibri" w:hAnsi="Calibri"/>
+        </w:rPr>
+        <w:t xml:space="preserve">Diaspora and democracy: Venezuela, Cuba and Nicaragua</w:t>
+      </w:r>
+    </w:p>
+    <w:p>
+      <w:pPr>
+        <w:keepNext/>
+        <w:spacing w:after="100"/>
+      </w:pPr>
+      <w:r>
+        <w:rPr>
+          <w:rFonts w:ascii="Calibri" w:cs="Calibri" w:eastAsia="Calibri" w:hAnsi="Calibri"/>
+          <w:sz w:val="20"/>
+          <w:szCs w:val="20"/>
+        </w:rPr>
+        <w:t xml:space="preserve">Only organizations confirmed by a source are included. For Nicaragua, where business chambers have been shut down, the table lists general organizations promoting democratic change.</w:t>
+      </w:r>
+    </w:p>
+    <w:p>
+      <w:pPr>
+        <w:pStyle w:val="Heading2"/>
+        <w:keepNext/>
+        <w:spacing w:after="60" w:before="120"/>
+      </w:pPr>
+      <w:r>
+        <w:rPr>
+          <w:rFonts w:ascii="Calibri" w:cs="Calibri" w:eastAsia="Calibri" w:hAnsi="Calibri"/>
+        </w:rPr>
+        <w:t xml:space="preserve">Venezuela</w:t>
+      </w:r>
+    </w:p>
+    <w:p>
+      <w:pPr>
+        <w:keepNext/>
+        <w:spacing w:after="100"/>
+      </w:pPr>
+      <w:r>
+        <w:rPr>
+          <w:rFonts w:ascii="Calibri" w:cs="Calibri" w:eastAsia="Calibri" w:hAnsi="Calibri"/>
+          <w:sz w:val="18"/>
+          <w:szCs w:val="18"/>
+        </w:rPr>
+        <w:t xml:space="preserve">Context: after the U.S. captured Nicolás Maduro on January 3, 2026, a transitional government is in place, sanctions have been partly eased and Venezuela has reconnected to SWIFT. Analysts describe the transition as fragile; rights groups cited more than 400 political prisoners as of February 2026.</w:t>
+      </w:r>
+    </w:p>
+    <w:tbl>
+      <w:tblPr>
+        <w:tblW w:type="dxa" w:w="13680"/>
+        <w:tblBorders>
+          <w:top w:val="single" w:color="auto" w:sz="4"/>
+          <w:left w:val="single" w:color="auto" w:sz="4"/>
+          <w:bottom w:val="single" w:color="auto" w:sz="4"/>
+          <w:right w:val="single" w:color="auto" w:sz="4"/>
+          <w:insideH w:val="single" w:color="auto" w:sz="4"/>
+          <w:insideV w:val="single" w:color="auto" w:sz="4"/>
+        </w:tblBorders>
+      </w:tblPr>
+      <w:tblGrid>
+        <w:gridCol w:w="2500"/>
+        <w:gridCol w:w="4300"/>
+        <w:gridCol w:w="4880"/>
+        <w:gridCol w:w="2000"/>
+      </w:tblGrid>
+      <w:tr>
+        <w:trPr>
+          <w:tblHeader/>
+        </w:trPr>
+        <w:tc>
+          <w:tcPr>
+            <w:tcW w:type="dxa" w:w="2500"/>
+            <w:shd w:fill="1F4E79" w:color="auto" w:val="clear"/>
+            <w:tcMar>
+              <w:top w:type="dxa" w:w="60"/>
+              <w:left w:type="dxa" w:w="90"/>
+              <w:bottom w:type="dxa" w:w="60"/>
+              <w:right w:type="dxa" w:w="90"/>
+            </w:tcMar>
+          </w:tcPr>
+          <w:p>
+            <w:pPr>
+              <w:spacing w:after="40"/>
+            </w:pPr>
+            <w:r>
+              <w:rPr>
+                <w:rFonts w:ascii="Calibri" w:cs="Calibri" w:eastAsia="Calibri" w:hAnsi="Calibri"/>
+                <w:b/>
+                <w:bCs/>
+                <w:color w:val="FFFFFF"/>
+                <w:sz w:val="18"/>
+                <w:szCs w:val="18"/>
+              </w:rPr>
+              <w:t xml:space="preserve">Organization</w:t>
+            </w:r>
+          </w:p>
+        </w:tc>
+        <w:tc>
+          <w:tcPr>
+            <w:tcW w:type="dxa" w:w="4300"/>
+            <w:shd w:fill="1F4E79" w:color="auto" w:val="clear"/>
+            <w:tcMar>
+              <w:top w:type="dxa" w:w="60"/>
+              <w:left w:type="dxa" w:w="90"/>
+              <w:bottom w:type="dxa" w:w="60"/>
+              <w:right w:type="dxa" w:w="90"/>
+            </w:tcMar>
+          </w:tcPr>
+          <w:p>
+            <w:pPr>
+              <w:spacing w:after="40"/>
+            </w:pPr>
+            <w:r>
+              <w:rPr>
+                <w:rFonts w:ascii="Calibri" w:cs="Calibri" w:eastAsia="Calibri" w:hAnsi="Calibri"/>
+                <w:b/>
+                <w:bCs/>
+                <w:color w:val="FFFFFF"/>
+                <w:sz w:val="18"/>
+                <w:szCs w:val="18"/>
+              </w:rPr>
+              <w:t xml:space="preserve">Type and mission</w:t>
+            </w:r>
+          </w:p>
+        </w:tc>
+        <w:tc>
+          <w:tcPr>
+            <w:tcW w:type="dxa" w:w="4880"/>
+            <w:shd w:fill="1F4E79" w:color="auto" w:val="clear"/>
+            <w:tcMar>
+              <w:top w:type="dxa" w:w="60"/>
+              <w:left w:type="dxa" w:w="90"/>
+              <w:bottom w:type="dxa" w:w="60"/>
+              <w:right w:type="dxa" w:w="90"/>
+            </w:tcMar>
+          </w:tcPr>
+          <w:p>
+            <w:pPr>
+              <w:spacing w:after="40"/>
+            </w:pPr>
+            <w:r>
+              <w:rPr>
+                <w:rFonts w:ascii="Calibri" w:cs="Calibri" w:eastAsia="Calibri" w:hAnsi="Calibri"/>
+                <w:b/>
+                <w:bCs/>
+                <w:color w:val="FFFFFF"/>
+                <w:sz w:val="18"/>
+                <w:szCs w:val="18"/>
+              </w:rPr>
+              <w:t xml:space="preserve">Link to U.S. sector priorities</w:t>
+            </w:r>
+          </w:p>
+        </w:tc>
+        <w:tc>
+          <w:tcPr>
+            <w:tcW w:type="dxa" w:w="2000"/>
+            <w:shd w:fill="1F4E79" w:color="auto" w:val="clear"/>
+            <w:tcMar>
+              <w:top w:type="dxa" w:w="60"/>
+              <w:left w:type="dxa" w:w="90"/>
+              <w:bottom w:type="dxa" w:w="60"/>
+              <w:right w:type="dxa" w:w="90"/>
+            </w:tcMar>
+          </w:tcPr>
+          <w:p>
+            <w:pPr>
+              <w:spacing w:after="40"/>
+            </w:pPr>
+            <w:r>
+              <w:rPr>
+                <w:rFonts w:ascii="Calibri" w:cs="Calibri" w:eastAsia="Calibri" w:hAnsi="Calibri"/>
+                <w:b/>
+                <w:bCs/>
+                <w:color w:val="FFFFFF"/>
+                <w:sz w:val="18"/>
+                <w:szCs w:val="18"/>
+              </w:rPr>
+              <w:t xml:space="preserve">Confidence</w:t>
+            </w:r>
+          </w:p>
+        </w:tc>
+      </w:tr>
+      <w:tr>
+        <w:trPr>
+          <w:cantSplit/>
+        </w:trPr>
+        <w:tc>
+          <w:tcPr>
+            <w:tcW w:type="dxa" w:w="2500"/>
+            <w:tcMar>
+              <w:top w:type="dxa" w:w="60"/>
+              <w:left w:type="dxa" w:w="90"/>
+              <w:bottom w:type="dxa" w:w="60"/>
+              <w:right w:type="dxa" w:w="90"/>
+            </w:tcMar>
+          </w:tcPr>
+          <w:p>
+            <w:pPr>
+              <w:spacing w:after="40"/>
+            </w:pPr>
+            <w:r>
+              <w:rPr>
+                <w:rFonts w:ascii="Calibri" w:cs="Calibri" w:eastAsia="Calibri" w:hAnsi="Calibri"/>
+                <w:b/>
+                <w:bCs/>
+                <w:sz w:val="17"/>
+                <w:szCs w:val="17"/>
+              </w:rPr>
+              <w:t xml:space="preserve">Venezuelan-American Chamber of Commerce of the United States (VACC)</w:t>
+            </w:r>
+            <w:r>
+              <w:rPr>
+                <w:rFonts w:ascii="Calibri" w:cs="Calibri" w:eastAsia="Calibri" w:hAnsi="Calibri"/>
+                <w:sz w:val="17"/>
+                <w:szCs w:val="17"/>
+              </w:rPr>
+              <w:t xml:space="preserve">, Miami</w:t>
+            </w:r>
+          </w:p>
+        </w:tc>
+        <w:tc>
+          <w:tcPr>
+            <w:tcW w:type="dxa" w:w="4300"/>
+            <w:tcMar>
+              <w:top w:type="dxa" w:w="60"/>
+              <w:left w:type="dxa" w:w="90"/>
+              <w:bottom w:type="dxa" w:w="60"/>
+              <w:right w:type="dxa" w:w="90"/>
+            </w:tcMar>
+          </w:tcPr>
+          <w:p>
+            <w:pPr>
+              <w:spacing w:after="40"/>
+            </w:pPr>
+            <w:r>
+              <w:rPr>
+                <w:rFonts w:ascii="Calibri" w:cs="Calibri" w:eastAsia="Calibri" w:hAnsi="Calibri"/>
+                <w:sz w:val="17"/>
+                <w:szCs w:val="17"/>
+              </w:rPr>
+              <w:t xml:space="preserve">Diaspora business chamber founded in 1991; self-funded nonprofit. President Leonardo Trechi (2026–2027). Aims to make the diaspora a "strategic bridge for the country's reconstruction" and to pursue investment "from a democratic, transparent, and development-oriented vision."</w:t>
+            </w:r>
+          </w:p>
+        </w:tc>
+        <w:tc>
+          <w:tcPr>
+            <w:tcW w:type="dxa" w:w="4880"/>
+            <w:tcMar>
+              <w:top w:type="dxa" w:w="60"/>
+              <w:left w:type="dxa" w:w="90"/>
+              <w:bottom w:type="dxa" w:w="60"/>
+              <w:right w:type="dxa" w:w="90"/>
+            </w:tcMar>
+          </w:tcPr>
+          <w:p>
+            <w:pPr>
+              <w:spacing w:after="40"/>
+            </w:pPr>
+            <w:r>
+              <w:rPr>
+                <w:rFonts w:ascii="Calibri" w:cs="Calibri" w:eastAsia="Calibri" w:hAnsi="Calibri"/>
+                <w:b/>
+                <w:bCs/>
+                <w:sz w:val="17"/>
+                <w:szCs w:val="17"/>
+              </w:rPr>
+              <w:t xml:space="preserve">All sectors:</w:t>
+            </w:r>
+            <w:r>
+              <w:rPr>
+                <w:rFonts w:ascii="Calibri" w:cs="Calibri" w:eastAsia="Calibri" w:hAnsi="Calibri"/>
+                <w:sz w:val="17"/>
+                <w:szCs w:val="17"/>
+              </w:rPr>
+              <w:t xml:space="preserve"> diaspora investment, talent and know-how; links to PortMiami (</w:t>
+            </w:r>
+            <w:r>
+              <w:rPr>
+                <w:rFonts w:ascii="Calibri" w:cs="Calibri" w:eastAsia="Calibri" w:hAnsi="Calibri"/>
+                <w:b/>
+                <w:bCs/>
+                <w:sz w:val="17"/>
+                <w:szCs w:val="17"/>
+              </w:rPr>
+              <w:t xml:space="preserve">logistics</w:t>
+            </w:r>
+            <w:r>
+              <w:rPr>
+                <w:rFonts w:ascii="Calibri" w:cs="Calibri" w:eastAsia="Calibri" w:hAnsi="Calibri"/>
+                <w:sz w:val="17"/>
+                <w:szCs w:val="17"/>
+              </w:rPr>
+              <w:t xml:space="preserve">); potential channel for </w:t>
+            </w:r>
+            <w:r>
+              <w:rPr>
+                <w:rFonts w:ascii="Calibri" w:cs="Calibri" w:eastAsia="Calibri" w:hAnsi="Calibri"/>
+                <w:b/>
+                <w:bCs/>
+                <w:sz w:val="17"/>
+                <w:szCs w:val="17"/>
+              </w:rPr>
+              <w:t xml:space="preserve">energy, finance and agriculture</w:t>
+            </w:r>
+            <w:r>
+              <w:rPr>
+                <w:rFonts w:ascii="Calibri" w:cs="Calibri" w:eastAsia="Calibri" w:hAnsi="Calibri"/>
+                <w:sz w:val="17"/>
+                <w:szCs w:val="17"/>
+              </w:rPr>
+              <w:t xml:space="preserve"> investment once rules are clear.</w:t>
+            </w:r>
+          </w:p>
+        </w:tc>
+        <w:tc>
+          <w:tcPr>
+            <w:tcW w:type="dxa" w:w="2000"/>
+            <w:tcMar>
+              <w:top w:type="dxa" w:w="60"/>
+              <w:left w:type="dxa" w:w="90"/>
+              <w:bottom w:type="dxa" w:w="60"/>
+              <w:right w:type="dxa" w:w="90"/>
+            </w:tcMar>
+          </w:tcPr>
+          <w:p>
+            <w:pPr>
+              <w:spacing w:after="40"/>
+            </w:pPr>
+            <w:r>
+              <w:rPr>
+                <w:rFonts w:ascii="Calibri" w:cs="Calibri" w:eastAsia="Calibri" w:hAnsi="Calibri"/>
+                <w:sz w:val="17"/>
+                <w:szCs w:val="17"/>
+              </w:rPr>
+              <w:t xml:space="preserve">✅ (mostly self-reported)</w:t>
+            </w:r>
+          </w:p>
+        </w:tc>
+      </w:tr>
+      <w:tr>
+        <w:trPr>
+          <w:cantSplit/>
+        </w:trPr>
+        <w:tc>
+          <w:tcPr>
+            <w:tcW w:type="dxa" w:w="2500"/>
+            <w:shd w:fill="EAF1F8" w:color="auto" w:val="clear"/>
+            <w:tcMar>
+              <w:top w:type="dxa" w:w="60"/>
+              <w:left w:type="dxa" w:w="90"/>
+              <w:bottom w:type="dxa" w:w="60"/>
+              <w:right w:type="dxa" w:w="90"/>
+            </w:tcMar>
+          </w:tcPr>
+          <w:p>
+            <w:pPr>
+              <w:spacing w:after="40"/>
+            </w:pPr>
+            <w:r>
+              <w:rPr>
+                <w:rFonts w:ascii="Calibri" w:cs="Calibri" w:eastAsia="Calibri" w:hAnsi="Calibri"/>
+                <w:b/>
+                <w:bCs/>
+                <w:sz w:val="17"/>
+                <w:szCs w:val="17"/>
+              </w:rPr>
+              <w:t xml:space="preserve">Fedecámaras</w:t>
+            </w:r>
+          </w:p>
+        </w:tc>
+        <w:tc>
+          <w:tcPr>
+            <w:tcW w:type="dxa" w:w="4300"/>
+            <w:shd w:fill="EAF1F8" w:color="auto" w:val="clear"/>
+            <w:tcMar>
+              <w:top w:type="dxa" w:w="60"/>
+              <w:left w:type="dxa" w:w="90"/>
+              <w:bottom w:type="dxa" w:w="60"/>
+              <w:right w:type="dxa" w:w="90"/>
+            </w:tcMar>
+          </w:tcPr>
+          <w:p>
+            <w:pPr>
+              <w:spacing w:after="40"/>
+            </w:pPr>
+            <w:r>
+              <w:rPr>
+                <w:rFonts w:ascii="Calibri" w:cs="Calibri" w:eastAsia="Calibri" w:hAnsi="Calibri"/>
+                <w:sz w:val="17"/>
+                <w:szCs w:val="17"/>
+              </w:rPr>
+              <w:t xml:space="preserve">Main federation of Venezuelan business chambers. President Ricardo Cusanno says it plans an alliance with Venezuelan entrepreneurs abroad. Its December 2025 "Carta de Valencia" calls for legal changes to protect private business and attract investment.</w:t>
+            </w:r>
+          </w:p>
+        </w:tc>
+        <w:tc>
+          <w:tcPr>
+            <w:tcW w:type="dxa" w:w="4880"/>
+            <w:shd w:fill="EAF1F8" w:color="auto" w:val="clear"/>
+            <w:tcMar>
+              <w:top w:type="dxa" w:w="60"/>
+              <w:left w:type="dxa" w:w="90"/>
+              <w:bottom w:type="dxa" w:w="60"/>
+              <w:right w:type="dxa" w:w="90"/>
+            </w:tcMar>
+          </w:tcPr>
+          <w:p>
+            <w:pPr>
+              <w:spacing w:after="40"/>
+            </w:pPr>
+            <w:r>
+              <w:rPr>
+                <w:rFonts w:ascii="Calibri" w:cs="Calibri" w:eastAsia="Calibri" w:hAnsi="Calibri"/>
+                <w:b/>
+                <w:bCs/>
+                <w:sz w:val="17"/>
+                <w:szCs w:val="17"/>
+              </w:rPr>
+              <w:t xml:space="preserve">All sectors:</w:t>
+            </w:r>
+            <w:r>
+              <w:rPr>
+                <w:rFonts w:ascii="Calibri" w:cs="Calibri" w:eastAsia="Calibri" w:hAnsi="Calibri"/>
+                <w:sz w:val="17"/>
+                <w:szCs w:val="17"/>
+              </w:rPr>
+              <w:t xml:space="preserve"> legal guarantees, stable rules, investor protection; presented investment opportunities to foreign firms in June 2026.</w:t>
+            </w:r>
+          </w:p>
+        </w:tc>
+        <w:tc>
+          <w:tcPr>
+            <w:tcW w:type="dxa" w:w="2000"/>
+            <w:shd w:fill="EAF1F8" w:color="auto" w:val="clear"/>
+            <w:tcMar>
+              <w:top w:type="dxa" w:w="60"/>
+              <w:left w:type="dxa" w:w="90"/>
+              <w:bottom w:type="dxa" w:w="60"/>
+              <w:right w:type="dxa" w:w="90"/>
+            </w:tcMar>
+          </w:tcPr>
+          <w:p>
+            <w:pPr>
+              <w:spacing w:after="40"/>
+            </w:pPr>
+            <w:r>
+              <w:rPr>
+                <w:rFonts w:ascii="Calibri" w:cs="Calibri" w:eastAsia="Calibri" w:hAnsi="Calibri"/>
+                <w:sz w:val="17"/>
+                <w:szCs w:val="17"/>
+              </w:rPr>
+              <w:t xml:space="preserve">✅</w:t>
+            </w:r>
+          </w:p>
+        </w:tc>
+      </w:tr>
+      <w:tr>
+        <w:trPr>
+          <w:cantSplit/>
+        </w:trPr>
+        <w:tc>
+          <w:tcPr>
+            <w:tcW w:type="dxa" w:w="2500"/>
+            <w:tcMar>
+              <w:top w:type="dxa" w:w="60"/>
+              <w:left w:type="dxa" w:w="90"/>
+              <w:bottom w:type="dxa" w:w="60"/>
+              <w:right w:type="dxa" w:w="90"/>
+            </w:tcMar>
+          </w:tcPr>
+          <w:p>
+            <w:pPr>
+              <w:spacing w:after="40"/>
+            </w:pPr>
+            <w:r>
+              <w:rPr>
+                <w:rFonts w:ascii="Calibri" w:cs="Calibri" w:eastAsia="Calibri" w:hAnsi="Calibri"/>
+                <w:b/>
+                <w:bCs/>
+                <w:sz w:val="17"/>
+                <w:szCs w:val="17"/>
+              </w:rPr>
+              <w:t xml:space="preserve">Conindustria</w:t>
+            </w:r>
+          </w:p>
+        </w:tc>
+        <w:tc>
+          <w:tcPr>
+            <w:tcW w:type="dxa" w:w="4300"/>
+            <w:tcMar>
+              <w:top w:type="dxa" w:w="60"/>
+              <w:left w:type="dxa" w:w="90"/>
+              <w:bottom w:type="dxa" w:w="60"/>
+              <w:right w:type="dxa" w:w="90"/>
+            </w:tcMar>
+          </w:tcPr>
+          <w:p>
+            <w:pPr>
+              <w:spacing w:after="40"/>
+            </w:pPr>
+            <w:r>
+              <w:rPr>
+                <w:rFonts w:ascii="Calibri" w:cs="Calibri" w:eastAsia="Calibri" w:hAnsi="Calibri"/>
+                <w:sz w:val="17"/>
+                <w:szCs w:val="17"/>
+              </w:rPr>
+              <w:t xml:space="preserve">Confederation of Venezuelan manufacturers. Reported private manufacturing up 9.9% in Q1 2026.</w:t>
+            </w:r>
+          </w:p>
+        </w:tc>
+        <w:tc>
+          <w:tcPr>
+            <w:tcW w:type="dxa" w:w="4880"/>
+            <w:tcMar>
+              <w:top w:type="dxa" w:w="60"/>
+              <w:left w:type="dxa" w:w="90"/>
+              <w:bottom w:type="dxa" w:w="60"/>
+              <w:right w:type="dxa" w:w="90"/>
+            </w:tcMar>
+          </w:tcPr>
+          <w:p>
+            <w:pPr>
+              <w:spacing w:after="40"/>
+            </w:pPr>
+            <w:r>
+              <w:rPr>
+                <w:rFonts w:ascii="Calibri" w:cs="Calibri" w:eastAsia="Calibri" w:hAnsi="Calibri"/>
+                <w:b/>
+                <w:bCs/>
+                <w:sz w:val="17"/>
+                <w:szCs w:val="17"/>
+              </w:rPr>
+              <w:t xml:space="preserve">Manufacturing, finance:</w:t>
+            </w:r>
+            <w:r>
+              <w:rPr>
+                <w:rFonts w:ascii="Calibri" w:cs="Calibri" w:eastAsia="Calibri" w:hAnsi="Calibri"/>
+                <w:sz w:val="17"/>
+                <w:szCs w:val="17"/>
+              </w:rPr>
+              <w:t xml:space="preserve"> credit, electricity and foreign-currency access.</w:t>
+            </w:r>
+          </w:p>
+        </w:tc>
+        <w:tc>
+          <w:tcPr>
+            <w:tcW w:type="dxa" w:w="2000"/>
+            <w:tcMar>
+              <w:top w:type="dxa" w:w="60"/>
+              <w:left w:type="dxa" w:w="90"/>
+              <w:bottom w:type="dxa" w:w="60"/>
+              <w:right w:type="dxa" w:w="90"/>
+            </w:tcMar>
+          </w:tcPr>
+          <w:p>
+            <w:pPr>
+              <w:spacing w:after="40"/>
+            </w:pPr>
+            <w:r>
+              <w:rPr>
+                <w:rFonts w:ascii="Calibri" w:cs="Calibri" w:eastAsia="Calibri" w:hAnsi="Calibri"/>
+                <w:sz w:val="17"/>
+                <w:szCs w:val="17"/>
+              </w:rPr>
+              <w:t xml:space="preserve">✅</w:t>
+            </w:r>
+          </w:p>
+        </w:tc>
+      </w:tr>
+    </w:tbl>
+    <w:p>
+      <w:pPr>
+        <w:pStyle w:val="Heading2"/>
+        <w:keepNext/>
+        <w:spacing w:after="60" w:before="120"/>
+      </w:pPr>
+      <w:r>
+        <w:rPr>
+          <w:rFonts w:ascii="Calibri" w:cs="Calibri" w:eastAsia="Calibri" w:hAnsi="Calibri"/>
+        </w:rPr>
+        <w:t xml:space="preserve">Cuba</w:t>
+      </w:r>
+    </w:p>
+    <w:p>
+      <w:pPr>
+        <w:keepNext/>
+        <w:spacing w:after="100"/>
+      </w:pPr>
+      <w:r>
+        <w:rPr>
+          <w:rFonts w:ascii="Calibri" w:cs="Calibri" w:eastAsia="Calibri" w:hAnsi="Calibri"/>
+          <w:sz w:val="18"/>
+          <w:szCs w:val="18"/>
+        </w:rPr>
+        <w:t xml:space="preserve">Context: repeated nationwide blackouts in 2026 amid a U.S.-imposed oil blockade; the U.S. is pressing for leadership change while negotiating. The embargo and the Helms-Burton Act still sharply limit U.S. business activity; check OFAC rules before any engagement. The organizations below differ sharply on whether to engage now or only after a transition.</w:t>
+      </w:r>
+    </w:p>
+    <w:tbl>
+      <w:tblPr>
+        <w:tblW w:type="dxa" w:w="13680"/>
+        <w:tblBorders>
+          <w:top w:val="single" w:color="auto" w:sz="4"/>
+          <w:left w:val="single" w:color="auto" w:sz="4"/>
+          <w:bottom w:val="single" w:color="auto" w:sz="4"/>
+          <w:right w:val="single" w:color="auto" w:sz="4"/>
+          <w:insideH w:val="single" w:color="auto" w:sz="4"/>
+          <w:insideV w:val="single" w:color="auto" w:sz="4"/>
+        </w:tblBorders>
+      </w:tblPr>
+      <w:tblGrid>
+        <w:gridCol w:w="2500"/>
+        <w:gridCol w:w="4300"/>
+        <w:gridCol w:w="4880"/>
+        <w:gridCol w:w="2000"/>
+      </w:tblGrid>
+      <w:tr>
+        <w:trPr>
+          <w:tblHeader/>
+        </w:trPr>
+        <w:tc>
+          <w:tcPr>
+            <w:tcW w:type="dxa" w:w="2500"/>
+            <w:shd w:fill="1F4E79" w:color="auto" w:val="clear"/>
+            <w:tcMar>
+              <w:top w:type="dxa" w:w="60"/>
+              <w:left w:type="dxa" w:w="90"/>
+              <w:bottom w:type="dxa" w:w="60"/>
+              <w:right w:type="dxa" w:w="90"/>
+            </w:tcMar>
+          </w:tcPr>
+          <w:p>
+            <w:pPr>
+              <w:spacing w:after="40"/>
+            </w:pPr>
+            <w:r>
+              <w:rPr>
+                <w:rFonts w:ascii="Calibri" w:cs="Calibri" w:eastAsia="Calibri" w:hAnsi="Calibri"/>
+                <w:b/>
+                <w:bCs/>
+                <w:color w:val="FFFFFF"/>
+                <w:sz w:val="18"/>
+                <w:szCs w:val="18"/>
+              </w:rPr>
+              <w:t xml:space="preserve">Organization</w:t>
+            </w:r>
+          </w:p>
+        </w:tc>
+        <w:tc>
+          <w:tcPr>
+            <w:tcW w:type="dxa" w:w="4300"/>
+            <w:shd w:fill="1F4E79" w:color="auto" w:val="clear"/>
+            <w:tcMar>
+              <w:top w:type="dxa" w:w="60"/>
+              <w:left w:type="dxa" w:w="90"/>
+              <w:bottom w:type="dxa" w:w="60"/>
+              <w:right w:type="dxa" w:w="90"/>
+            </w:tcMar>
+          </w:tcPr>
+          <w:p>
+            <w:pPr>
+              <w:spacing w:after="40"/>
+            </w:pPr>
+            <w:r>
+              <w:rPr>
+                <w:rFonts w:ascii="Calibri" w:cs="Calibri" w:eastAsia="Calibri" w:hAnsi="Calibri"/>
+                <w:b/>
+                <w:bCs/>
+                <w:color w:val="FFFFFF"/>
+                <w:sz w:val="18"/>
+                <w:szCs w:val="18"/>
+              </w:rPr>
+              <w:t xml:space="preserve">Type and mission</w:t>
+            </w:r>
+          </w:p>
+        </w:tc>
+        <w:tc>
+          <w:tcPr>
+            <w:tcW w:type="dxa" w:w="4880"/>
+            <w:shd w:fill="1F4E79" w:color="auto" w:val="clear"/>
+            <w:tcMar>
+              <w:top w:type="dxa" w:w="60"/>
+              <w:left w:type="dxa" w:w="90"/>
+              <w:bottom w:type="dxa" w:w="60"/>
+              <w:right w:type="dxa" w:w="90"/>
+            </w:tcMar>
+          </w:tcPr>
+          <w:p>
+            <w:pPr>
+              <w:spacing w:after="40"/>
+            </w:pPr>
+            <w:r>
+              <w:rPr>
+                <w:rFonts w:ascii="Calibri" w:cs="Calibri" w:eastAsia="Calibri" w:hAnsi="Calibri"/>
+                <w:b/>
+                <w:bCs/>
+                <w:color w:val="FFFFFF"/>
+                <w:sz w:val="18"/>
+                <w:szCs w:val="18"/>
+              </w:rPr>
+              <w:t xml:space="preserve">Link to U.S. sector priorities</w:t>
+            </w:r>
+          </w:p>
+        </w:tc>
+        <w:tc>
+          <w:tcPr>
+            <w:tcW w:type="dxa" w:w="2000"/>
+            <w:shd w:fill="1F4E79" w:color="auto" w:val="clear"/>
+            <w:tcMar>
+              <w:top w:type="dxa" w:w="60"/>
+              <w:left w:type="dxa" w:w="90"/>
+              <w:bottom w:type="dxa" w:w="60"/>
+              <w:right w:type="dxa" w:w="90"/>
+            </w:tcMar>
+          </w:tcPr>
+          <w:p>
+            <w:pPr>
+              <w:spacing w:after="40"/>
+            </w:pPr>
+            <w:r>
+              <w:rPr>
+                <w:rFonts w:ascii="Calibri" w:cs="Calibri" w:eastAsia="Calibri" w:hAnsi="Calibri"/>
+                <w:b/>
+                <w:bCs/>
+                <w:color w:val="FFFFFF"/>
+                <w:sz w:val="18"/>
+                <w:szCs w:val="18"/>
+              </w:rPr>
+              <w:t xml:space="preserve">Confidence</w:t>
+            </w:r>
+          </w:p>
+        </w:tc>
+      </w:tr>
+      <w:tr>
+        <w:trPr>
+          <w:cantSplit/>
+        </w:trPr>
+        <w:tc>
+          <w:tcPr>
+            <w:tcW w:type="dxa" w:w="2500"/>
+            <w:tcMar>
+              <w:top w:type="dxa" w:w="60"/>
+              <w:left w:type="dxa" w:w="90"/>
+              <w:bottom w:type="dxa" w:w="60"/>
+              <w:right w:type="dxa" w:w="90"/>
+            </w:tcMar>
+          </w:tcPr>
+          <w:p>
+            <w:pPr>
+              <w:spacing w:after="40"/>
+            </w:pPr>
+            <w:r>
+              <w:rPr>
+                <w:rFonts w:ascii="Calibri" w:cs="Calibri" w:eastAsia="Calibri" w:hAnsi="Calibri"/>
+                <w:b/>
+                <w:bCs/>
+                <w:sz w:val="17"/>
+                <w:szCs w:val="17"/>
+              </w:rPr>
+              <w:t xml:space="preserve">Cuban-American National Chamber of Commerce (CANCC)</w:t>
+            </w:r>
+            <w:r>
+              <w:rPr>
+                <w:rFonts w:ascii="Calibri" w:cs="Calibri" w:eastAsia="Calibri" w:hAnsi="Calibri"/>
+                <w:sz w:val="17"/>
+                <w:szCs w:val="17"/>
+              </w:rPr>
+              <w:t xml:space="preserve">, Miami</w:t>
+            </w:r>
+          </w:p>
+        </w:tc>
+        <w:tc>
+          <w:tcPr>
+            <w:tcW w:type="dxa" w:w="4300"/>
+            <w:tcMar>
+              <w:top w:type="dxa" w:w="60"/>
+              <w:left w:type="dxa" w:w="90"/>
+              <w:bottom w:type="dxa" w:w="60"/>
+              <w:right w:type="dxa" w:w="90"/>
+            </w:tcMar>
+          </w:tcPr>
+          <w:p>
+            <w:pPr>
+              <w:spacing w:after="40"/>
+            </w:pPr>
+            <w:r>
+              <w:rPr>
+                <w:rFonts w:ascii="Calibri" w:cs="Calibri" w:eastAsia="Calibri" w:hAnsi="Calibri"/>
+                <w:sz w:val="17"/>
+                <w:szCs w:val="17"/>
+              </w:rPr>
+              <w:t xml:space="preserve">Founded in 2026; chaired by Juan Omar Sixto. Members pledge to invest "once the regime falls" and only with private Cuban entrepreneurs with no ties to the government, within the Helms-Burton framework.</w:t>
+            </w:r>
+          </w:p>
+        </w:tc>
+        <w:tc>
+          <w:tcPr>
+            <w:tcW w:type="dxa" w:w="4880"/>
+            <w:tcMar>
+              <w:top w:type="dxa" w:w="60"/>
+              <w:left w:type="dxa" w:w="90"/>
+              <w:bottom w:type="dxa" w:w="60"/>
+              <w:right w:type="dxa" w:w="90"/>
+            </w:tcMar>
+          </w:tcPr>
+          <w:p>
+            <w:pPr>
+              <w:spacing w:after="40"/>
+            </w:pPr>
+            <w:r>
+              <w:rPr>
+                <w:rFonts w:ascii="Calibri" w:cs="Calibri" w:eastAsia="Calibri" w:hAnsi="Calibri"/>
+                <w:b/>
+                <w:bCs/>
+                <w:sz w:val="17"/>
+                <w:szCs w:val="17"/>
+              </w:rPr>
+              <w:t xml:space="preserve">Democracy-conditioned investment</w:t>
+            </w:r>
+            <w:r>
+              <w:rPr>
+                <w:rFonts w:ascii="Calibri" w:cs="Calibri" w:eastAsia="Calibri" w:hAnsi="Calibri"/>
+                <w:sz w:val="17"/>
+                <w:szCs w:val="17"/>
+              </w:rPr>
+              <w:t xml:space="preserve"> in </w:t>
+            </w:r>
+            <w:r>
+              <w:rPr>
+                <w:rFonts w:ascii="Calibri" w:cs="Calibri" w:eastAsia="Calibri" w:hAnsi="Calibri"/>
+                <w:b/>
+                <w:bCs/>
+                <w:sz w:val="17"/>
+                <w:szCs w:val="17"/>
+              </w:rPr>
+              <w:t xml:space="preserve">energy (including solar), agriculture, water, finance (a stock exchange) and sugar</w:t>
+            </w:r>
+            <w:r>
+              <w:rPr>
+                <w:rFonts w:ascii="Calibri" w:cs="Calibri" w:eastAsia="Calibri" w:hAnsi="Calibri"/>
+                <w:sz w:val="17"/>
+                <w:szCs w:val="17"/>
+              </w:rPr>
+              <w:t xml:space="preserve">.</w:t>
+            </w:r>
+          </w:p>
+        </w:tc>
+        <w:tc>
+          <w:tcPr>
+            <w:tcW w:type="dxa" w:w="2000"/>
+            <w:tcMar>
+              <w:top w:type="dxa" w:w="60"/>
+              <w:left w:type="dxa" w:w="90"/>
+              <w:bottom w:type="dxa" w:w="60"/>
+              <w:right w:type="dxa" w:w="90"/>
+            </w:tcMar>
+          </w:tcPr>
+          <w:p>
+            <w:pPr>
+              <w:spacing w:after="40"/>
+            </w:pPr>
+            <w:r>
+              <w:rPr>
+                <w:rFonts w:ascii="Calibri" w:cs="Calibri" w:eastAsia="Calibri" w:hAnsi="Calibri"/>
+                <w:sz w:val="17"/>
+                <w:szCs w:val="17"/>
+              </w:rPr>
+              <w:t xml:space="preserve">✅</w:t>
+            </w:r>
+          </w:p>
+        </w:tc>
+      </w:tr>
+      <w:tr>
+        <w:trPr>
+          <w:cantSplit/>
+        </w:trPr>
+        <w:tc>
+          <w:tcPr>
+            <w:tcW w:type="dxa" w:w="2500"/>
+            <w:shd w:fill="EAF1F8" w:color="auto" w:val="clear"/>
+            <w:tcMar>
+              <w:top w:type="dxa" w:w="60"/>
+              <w:left w:type="dxa" w:w="90"/>
+              <w:bottom w:type="dxa" w:w="60"/>
+              <w:right w:type="dxa" w:w="90"/>
+            </w:tcMar>
+          </w:tcPr>
+          <w:p>
+            <w:pPr>
+              <w:spacing w:after="40"/>
+            </w:pPr>
+            <w:r>
+              <w:rPr>
+                <w:rFonts w:ascii="Calibri" w:cs="Calibri" w:eastAsia="Calibri" w:hAnsi="Calibri"/>
+                <w:b/>
+                <w:bCs/>
+                <w:sz w:val="17"/>
+                <w:szCs w:val="17"/>
+              </w:rPr>
+              <w:t xml:space="preserve">Cuba Study Group</w:t>
+            </w:r>
+          </w:p>
+        </w:tc>
+        <w:tc>
+          <w:tcPr>
+            <w:tcW w:type="dxa" w:w="4300"/>
+            <w:shd w:fill="EAF1F8" w:color="auto" w:val="clear"/>
+            <w:tcMar>
+              <w:top w:type="dxa" w:w="60"/>
+              <w:left w:type="dxa" w:w="90"/>
+              <w:bottom w:type="dxa" w:w="60"/>
+              <w:right w:type="dxa" w:w="90"/>
+            </w:tcMar>
+          </w:tcPr>
+          <w:p>
+            <w:pPr>
+              <w:spacing w:after="40"/>
+            </w:pPr>
+            <w:r>
+              <w:rPr>
+                <w:rFonts w:ascii="Calibri" w:cs="Calibri" w:eastAsia="Calibri" w:hAnsi="Calibri"/>
+                <w:sz w:val="17"/>
+                <w:szCs w:val="17"/>
+              </w:rPr>
+              <w:t xml:space="preserve">Nonprofit, nonpartisan group of Cuban-American business leaders and young professionals, chaired by Carlos Saladrigas. Seeks to rebuild Cuba's private sector and connect it with the diaspora; urges reforms allowing U.S. investment in Cuban private businesses. Critics say it puts business ahead of human rights.</w:t>
+            </w:r>
+          </w:p>
+        </w:tc>
+        <w:tc>
+          <w:tcPr>
+            <w:tcW w:type="dxa" w:w="4880"/>
+            <w:shd w:fill="EAF1F8" w:color="auto" w:val="clear"/>
+            <w:tcMar>
+              <w:top w:type="dxa" w:w="60"/>
+              <w:left w:type="dxa" w:w="90"/>
+              <w:bottom w:type="dxa" w:w="60"/>
+              <w:right w:type="dxa" w:w="90"/>
+            </w:tcMar>
+          </w:tcPr>
+          <w:p>
+            <w:pPr>
+              <w:spacing w:after="40"/>
+            </w:pPr>
+            <w:r>
+              <w:rPr>
+                <w:rFonts w:ascii="Calibri" w:cs="Calibri" w:eastAsia="Calibri" w:hAnsi="Calibri"/>
+                <w:b/>
+                <w:bCs/>
+                <w:sz w:val="17"/>
+                <w:szCs w:val="17"/>
+              </w:rPr>
+              <w:t xml:space="preserve">Agriculture/food production, finance:</w:t>
+            </w:r>
+            <w:r>
+              <w:rPr>
+                <w:rFonts w:ascii="Calibri" w:cs="Calibri" w:eastAsia="Calibri" w:hAnsi="Calibri"/>
+                <w:sz w:val="17"/>
+                <w:szCs w:val="17"/>
+              </w:rPr>
+              <w:t xml:space="preserve"> support for Cuban private small businesses (mipymes) within U.S. law.</w:t>
+            </w:r>
+          </w:p>
+        </w:tc>
+        <w:tc>
+          <w:tcPr>
+            <w:tcW w:type="dxa" w:w="2000"/>
+            <w:shd w:fill="EAF1F8" w:color="auto" w:val="clear"/>
+            <w:tcMar>
+              <w:top w:type="dxa" w:w="60"/>
+              <w:left w:type="dxa" w:w="90"/>
+              <w:bottom w:type="dxa" w:w="60"/>
+              <w:right w:type="dxa" w:w="90"/>
+            </w:tcMar>
+          </w:tcPr>
+          <w:p>
+            <w:pPr>
+              <w:spacing w:after="40"/>
+            </w:pPr>
+            <w:r>
+              <w:rPr>
+                <w:rFonts w:ascii="Calibri" w:cs="Calibri" w:eastAsia="Calibri" w:hAnsi="Calibri"/>
+                <w:sz w:val="17"/>
+                <w:szCs w:val="17"/>
+              </w:rPr>
+              <w:t xml:space="preserve">✅</w:t>
+            </w:r>
+          </w:p>
+        </w:tc>
+      </w:tr>
+      <w:tr>
+        <w:trPr>
+          <w:cantSplit/>
+        </w:trPr>
+        <w:tc>
+          <w:tcPr>
+            <w:tcW w:type="dxa" w:w="2500"/>
+            <w:tcMar>
+              <w:top w:type="dxa" w:w="60"/>
+              <w:left w:type="dxa" w:w="90"/>
+              <w:bottom w:type="dxa" w:w="60"/>
+              <w:right w:type="dxa" w:w="90"/>
+            </w:tcMar>
+          </w:tcPr>
+          <w:p>
+            <w:pPr>
+              <w:spacing w:after="40"/>
+            </w:pPr>
+            <w:r>
+              <w:rPr>
+                <w:rFonts w:ascii="Calibri" w:cs="Calibri" w:eastAsia="Calibri" w:hAnsi="Calibri"/>
+                <w:b/>
+                <w:bCs/>
+                <w:sz w:val="17"/>
+                <w:szCs w:val="17"/>
+              </w:rPr>
+              <w:t xml:space="preserve">U.S.-Cuba Business Council (U.S. Chamber of Commerce)</w:t>
+            </w:r>
+          </w:p>
+        </w:tc>
+        <w:tc>
+          <w:tcPr>
+            <w:tcW w:type="dxa" w:w="4300"/>
+            <w:tcMar>
+              <w:top w:type="dxa" w:w="60"/>
+              <w:left w:type="dxa" w:w="90"/>
+              <w:bottom w:type="dxa" w:w="60"/>
+              <w:right w:type="dxa" w:w="90"/>
+            </w:tcMar>
+          </w:tcPr>
+          <w:p>
+            <w:pPr>
+              <w:spacing w:after="40"/>
+            </w:pPr>
+            <w:r>
+              <w:rPr>
+                <w:rFonts w:ascii="Calibri" w:cs="Calibri" w:eastAsia="Calibri" w:hAnsi="Calibri"/>
+                <w:sz w:val="17"/>
+                <w:szCs w:val="17"/>
+              </w:rPr>
+              <w:t xml:space="preserve">U.S. Chamber council launched in September 2015. Agenda included remittances, support for Cuban private entrepreneurs and business-to-business licenses.</w:t>
+            </w:r>
+          </w:p>
+        </w:tc>
+        <w:tc>
+          <w:tcPr>
+            <w:tcW w:type="dxa" w:w="4880"/>
+            <w:tcMar>
+              <w:top w:type="dxa" w:w="60"/>
+              <w:left w:type="dxa" w:w="90"/>
+              <w:bottom w:type="dxa" w:w="60"/>
+              <w:right w:type="dxa" w:w="90"/>
+            </w:tcMar>
+          </w:tcPr>
+          <w:p>
+            <w:pPr>
+              <w:spacing w:after="40"/>
+            </w:pPr>
+            <w:r>
+              <w:rPr>
+                <w:rFonts w:ascii="Calibri" w:cs="Calibri" w:eastAsia="Calibri" w:hAnsi="Calibri"/>
+                <w:b/>
+                <w:bCs/>
+                <w:sz w:val="17"/>
+                <w:szCs w:val="17"/>
+              </w:rPr>
+              <w:t xml:space="preserve">All sectors:</w:t>
+            </w:r>
+            <w:r>
+              <w:rPr>
+                <w:rFonts w:ascii="Calibri" w:cs="Calibri" w:eastAsia="Calibri" w:hAnsi="Calibri"/>
+                <w:sz w:val="17"/>
+                <w:szCs w:val="17"/>
+              </w:rPr>
+              <w:t xml:space="preserve"> formal channel for U.S. companies. Current activity not confirmed.</w:t>
+            </w:r>
+          </w:p>
+        </w:tc>
+        <w:tc>
+          <w:tcPr>
+            <w:tcW w:type="dxa" w:w="2000"/>
+            <w:tcMar>
+              <w:top w:type="dxa" w:w="60"/>
+              <w:left w:type="dxa" w:w="90"/>
+              <w:bottom w:type="dxa" w:w="60"/>
+              <w:right w:type="dxa" w:w="90"/>
+            </w:tcMar>
+          </w:tcPr>
+          <w:p>
+            <w:pPr>
+              <w:spacing w:after="40"/>
+            </w:pPr>
+            <w:r>
+              <w:rPr>
+                <w:rFonts w:ascii="Calibri" w:cs="Calibri" w:eastAsia="Calibri" w:hAnsi="Calibri"/>
+                <w:sz w:val="17"/>
+                <w:szCs w:val="17"/>
+              </w:rPr>
+              <w:t xml:space="preserve">✅ exists / ⚠️ status</w:t>
+            </w:r>
+          </w:p>
+        </w:tc>
+      </w:tr>
+    </w:tbl>
+    <w:p>
+      <w:pPr>
+        <w:pStyle w:val="Heading2"/>
+        <w:keepNext/>
+        <w:spacing w:after="60" w:before="120"/>
+      </w:pPr>
+      <w:r>
+        <w:rPr>
+          <w:rFonts w:ascii="Calibri" w:cs="Calibri" w:eastAsia="Calibri" w:hAnsi="Calibri"/>
+        </w:rPr>
+        <w:t xml:space="preserve">Nicaragua</w:t>
+      </w:r>
+    </w:p>
+    <w:p>
+      <w:pPr>
+        <w:keepNext/>
+        <w:spacing w:after="100"/>
+      </w:pPr>
+      <w:r>
+        <w:rPr>
+          <w:rFonts w:ascii="Calibri" w:cs="Calibri" w:eastAsia="Calibri" w:hAnsi="Calibri"/>
+          <w:sz w:val="18"/>
+          <w:szCs w:val="18"/>
+        </w:rPr>
+        <w:t xml:space="preserve">Context: the government cancelled the legal status of COSEP and 18 business chambers in 2023 and closed 151 more (including AmCham Nicaragua) in 2024. The September 2026 U.S. Investment Climate Statement reports continued political prisoners, forced exile and property seizures, including against private-sector leaders. No formal business association promoting democracy was found; the organizations below are general groups promoting democratic change. Check U.S. sanctions rules before engagement.</w:t>
+      </w:r>
+    </w:p>
+    <w:tbl>
+      <w:tblPr>
+        <w:tblW w:type="dxa" w:w="13680"/>
+        <w:tblBorders>
+          <w:top w:val="single" w:color="auto" w:sz="4"/>
+          <w:left w:val="single" w:color="auto" w:sz="4"/>
+          <w:bottom w:val="single" w:color="auto" w:sz="4"/>
+          <w:right w:val="single" w:color="auto" w:sz="4"/>
+          <w:insideH w:val="single" w:color="auto" w:sz="4"/>
+          <w:insideV w:val="single" w:color="auto" w:sz="4"/>
+        </w:tblBorders>
+      </w:tblPr>
+      <w:tblGrid>
+        <w:gridCol w:w="2500"/>
+        <w:gridCol w:w="4300"/>
+        <w:gridCol w:w="4880"/>
+        <w:gridCol w:w="2000"/>
+      </w:tblGrid>
+      <w:tr>
+        <w:trPr>
+          <w:tblHeader/>
+        </w:trPr>
+        <w:tc>
+          <w:tcPr>
+            <w:tcW w:type="dxa" w:w="2500"/>
+            <w:shd w:fill="1F4E79" w:color="auto" w:val="clear"/>
+            <w:tcMar>
+              <w:top w:type="dxa" w:w="60"/>
+              <w:left w:type="dxa" w:w="90"/>
+              <w:bottom w:type="dxa" w:w="60"/>
+              <w:right w:type="dxa" w:w="90"/>
+            </w:tcMar>
+          </w:tcPr>
+          <w:p>
+            <w:pPr>
+              <w:spacing w:after="40"/>
+            </w:pPr>
+            <w:r>
+              <w:rPr>
+                <w:rFonts w:ascii="Calibri" w:cs="Calibri" w:eastAsia="Calibri" w:hAnsi="Calibri"/>
+                <w:b/>
+                <w:bCs/>
+                <w:color w:val="FFFFFF"/>
+                <w:sz w:val="18"/>
+                <w:szCs w:val="18"/>
+              </w:rPr>
+              <w:t xml:space="preserve">Organization</w:t>
+            </w:r>
+          </w:p>
+        </w:tc>
+        <w:tc>
+          <w:tcPr>
+            <w:tcW w:type="dxa" w:w="4300"/>
+            <w:shd w:fill="1F4E79" w:color="auto" w:val="clear"/>
+            <w:tcMar>
+              <w:top w:type="dxa" w:w="60"/>
+              <w:left w:type="dxa" w:w="90"/>
+              <w:bottom w:type="dxa" w:w="60"/>
+              <w:right w:type="dxa" w:w="90"/>
+            </w:tcMar>
+          </w:tcPr>
+          <w:p>
+            <w:pPr>
+              <w:spacing w:after="40"/>
+            </w:pPr>
+            <w:r>
+              <w:rPr>
+                <w:rFonts w:ascii="Calibri" w:cs="Calibri" w:eastAsia="Calibri" w:hAnsi="Calibri"/>
+                <w:b/>
+                <w:bCs/>
+                <w:color w:val="FFFFFF"/>
+                <w:sz w:val="18"/>
+                <w:szCs w:val="18"/>
+              </w:rPr>
+              <w:t xml:space="preserve">Type and mission</w:t>
+            </w:r>
+          </w:p>
+        </w:tc>
+        <w:tc>
+          <w:tcPr>
+            <w:tcW w:type="dxa" w:w="4880"/>
+            <w:shd w:fill="1F4E79" w:color="auto" w:val="clear"/>
+            <w:tcMar>
+              <w:top w:type="dxa" w:w="60"/>
+              <w:left w:type="dxa" w:w="90"/>
+              <w:bottom w:type="dxa" w:w="60"/>
+              <w:right w:type="dxa" w:w="90"/>
+            </w:tcMar>
+          </w:tcPr>
+          <w:p>
+            <w:pPr>
+              <w:spacing w:after="40"/>
+            </w:pPr>
+            <w:r>
+              <w:rPr>
+                <w:rFonts w:ascii="Calibri" w:cs="Calibri" w:eastAsia="Calibri" w:hAnsi="Calibri"/>
+                <w:b/>
+                <w:bCs/>
+                <w:color w:val="FFFFFF"/>
+                <w:sz w:val="18"/>
+                <w:szCs w:val="18"/>
+              </w:rPr>
+              <w:t xml:space="preserve">Link to U.S. sector priorities</w:t>
+            </w:r>
+          </w:p>
+        </w:tc>
+        <w:tc>
+          <w:tcPr>
+            <w:tcW w:type="dxa" w:w="2000"/>
+            <w:shd w:fill="1F4E79" w:color="auto" w:val="clear"/>
+            <w:tcMar>
+              <w:top w:type="dxa" w:w="60"/>
+              <w:left w:type="dxa" w:w="90"/>
+              <w:bottom w:type="dxa" w:w="60"/>
+              <w:right w:type="dxa" w:w="90"/>
+            </w:tcMar>
+          </w:tcPr>
+          <w:p>
+            <w:pPr>
+              <w:spacing w:after="40"/>
+            </w:pPr>
+            <w:r>
+              <w:rPr>
+                <w:rFonts w:ascii="Calibri" w:cs="Calibri" w:eastAsia="Calibri" w:hAnsi="Calibri"/>
+                <w:b/>
+                <w:bCs/>
+                <w:color w:val="FFFFFF"/>
+                <w:sz w:val="18"/>
+                <w:szCs w:val="18"/>
+              </w:rPr>
+              <w:t xml:space="preserve">Confidence</w:t>
+            </w:r>
+          </w:p>
+        </w:tc>
+      </w:tr>
+      <w:tr>
+        <w:trPr>
+          <w:cantSplit/>
+        </w:trPr>
+        <w:tc>
+          <w:tcPr>
+            <w:tcW w:type="dxa" w:w="2500"/>
+            <w:tcMar>
+              <w:top w:type="dxa" w:w="60"/>
+              <w:left w:type="dxa" w:w="90"/>
+              <w:bottom w:type="dxa" w:w="60"/>
+              <w:right w:type="dxa" w:w="90"/>
+            </w:tcMar>
+          </w:tcPr>
+          <w:p>
+            <w:pPr>
+              <w:spacing w:after="40"/>
+            </w:pPr>
+            <w:r>
+              <w:rPr>
+                <w:rFonts w:ascii="Calibri" w:cs="Calibri" w:eastAsia="Calibri" w:hAnsi="Calibri"/>
+                <w:b/>
+                <w:bCs/>
+                <w:sz w:val="17"/>
+                <w:szCs w:val="17"/>
+              </w:rPr>
+              <w:t xml:space="preserve">Concertación Democrática Nicaragüense</w:t>
+            </w:r>
+          </w:p>
+        </w:tc>
+        <w:tc>
+          <w:tcPr>
+            <w:tcW w:type="dxa" w:w="4300"/>
+            <w:tcMar>
+              <w:top w:type="dxa" w:w="60"/>
+              <w:left w:type="dxa" w:w="90"/>
+              <w:bottom w:type="dxa" w:w="60"/>
+              <w:right w:type="dxa" w:w="90"/>
+            </w:tcMar>
+          </w:tcPr>
+          <w:p>
+            <w:pPr>
+              <w:spacing w:after="40"/>
+            </w:pPr>
+            <w:r>
+              <w:rPr>
+                <w:rFonts w:ascii="Calibri" w:cs="Calibri" w:eastAsia="Calibri" w:hAnsi="Calibri"/>
+                <w:sz w:val="17"/>
+                <w:szCs w:val="17"/>
+              </w:rPr>
+              <w:t xml:space="preserve">Coalition of Nicaraguan opposition groups in exile. In May 2026 it asked the Organization of American States to keep Nicaragua on its General Assembly agenda.</w:t>
+            </w:r>
+          </w:p>
+        </w:tc>
+        <w:tc>
+          <w:tcPr>
+            <w:tcW w:type="dxa" w:w="4880"/>
+            <w:tcMar>
+              <w:top w:type="dxa" w:w="60"/>
+              <w:left w:type="dxa" w:w="90"/>
+              <w:bottom w:type="dxa" w:w="60"/>
+              <w:right w:type="dxa" w:w="90"/>
+            </w:tcMar>
+          </w:tcPr>
+          <w:p>
+            <w:pPr>
+              <w:spacing w:after="40"/>
+            </w:pPr>
+            <w:r>
+              <w:rPr>
+                <w:rFonts w:ascii="Calibri" w:cs="Calibri" w:eastAsia="Calibri" w:hAnsi="Calibri"/>
+                <w:b/>
+                <w:bCs/>
+                <w:sz w:val="17"/>
+                <w:szCs w:val="17"/>
+              </w:rPr>
+              <w:t xml:space="preserve">Democracy and rule of law:</w:t>
+            </w:r>
+            <w:r>
+              <w:rPr>
+                <w:rFonts w:ascii="Calibri" w:cs="Calibri" w:eastAsia="Calibri" w:hAnsi="Calibri"/>
+                <w:sz w:val="17"/>
+                <w:szCs w:val="17"/>
+              </w:rPr>
+              <w:t xml:space="preserve"> international advocacy; private-sector participation not confirmed.</w:t>
+            </w:r>
+          </w:p>
+        </w:tc>
+        <w:tc>
+          <w:tcPr>
+            <w:tcW w:type="dxa" w:w="2000"/>
+            <w:tcMar>
+              <w:top w:type="dxa" w:w="60"/>
+              <w:left w:type="dxa" w:w="90"/>
+              <w:bottom w:type="dxa" w:w="60"/>
+              <w:right w:type="dxa" w:w="90"/>
+            </w:tcMar>
+          </w:tcPr>
+          <w:p>
+            <w:pPr>
+              <w:spacing w:after="40"/>
+            </w:pPr>
+            <w:r>
+              <w:rPr>
+                <w:rFonts w:ascii="Calibri" w:cs="Calibri" w:eastAsia="Calibri" w:hAnsi="Calibri"/>
+                <w:sz w:val="17"/>
+                <w:szCs w:val="17"/>
+              </w:rPr>
+              <w:t xml:space="preserve">✅</w:t>
+            </w:r>
+          </w:p>
+        </w:tc>
+      </w:tr>
+      <w:tr>
+        <w:trPr>
+          <w:cantSplit/>
+        </w:trPr>
+        <w:tc>
+          <w:tcPr>
+            <w:tcW w:type="dxa" w:w="2500"/>
+            <w:shd w:fill="EAF1F8" w:color="auto" w:val="clear"/>
+            <w:tcMar>
+              <w:top w:type="dxa" w:w="60"/>
+              <w:left w:type="dxa" w:w="90"/>
+              <w:bottom w:type="dxa" w:w="60"/>
+              <w:right w:type="dxa" w:w="90"/>
+            </w:tcMar>
+          </w:tcPr>
+          <w:p>
+            <w:pPr>
+              <w:spacing w:after="40"/>
+            </w:pPr>
+            <w:r>
+              <w:rPr>
+                <w:rFonts w:ascii="Calibri" w:cs="Calibri" w:eastAsia="Calibri" w:hAnsi="Calibri"/>
+                <w:b/>
+                <w:bCs/>
+                <w:sz w:val="17"/>
+                <w:szCs w:val="17"/>
+              </w:rPr>
+              <w:t xml:space="preserve">Alianza Cívica (Civic Alliance)</w:t>
+            </w:r>
+          </w:p>
+        </w:tc>
+        <w:tc>
+          <w:tcPr>
+            <w:tcW w:type="dxa" w:w="4300"/>
+            <w:shd w:fill="EAF1F8" w:color="auto" w:val="clear"/>
+            <w:tcMar>
+              <w:top w:type="dxa" w:w="60"/>
+              <w:left w:type="dxa" w:w="90"/>
+              <w:bottom w:type="dxa" w:w="60"/>
+              <w:right w:type="dxa" w:w="90"/>
+            </w:tcMar>
+          </w:tcPr>
+          <w:p>
+            <w:pPr>
+              <w:spacing w:after="40"/>
+            </w:pPr>
+            <w:r>
+              <w:rPr>
+                <w:rFonts w:ascii="Calibri" w:cs="Calibri" w:eastAsia="Calibri" w:hAnsi="Calibri"/>
+                <w:sz w:val="17"/>
+                <w:szCs w:val="17"/>
+              </w:rPr>
+              <w:t xml:space="preserve">Opposition coalition formed in 2018 that included COSEP's leadership (president José Adán Aguerri) after business broke with Ortega.</w:t>
+            </w:r>
+          </w:p>
+        </w:tc>
+        <w:tc>
+          <w:tcPr>
+            <w:tcW w:type="dxa" w:w="4880"/>
+            <w:shd w:fill="EAF1F8" w:color="auto" w:val="clear"/>
+            <w:tcMar>
+              <w:top w:type="dxa" w:w="60"/>
+              <w:left w:type="dxa" w:w="90"/>
+              <w:bottom w:type="dxa" w:w="60"/>
+              <w:right w:type="dxa" w:w="90"/>
+            </w:tcMar>
+          </w:tcPr>
+          <w:p>
+            <w:pPr>
+              <w:spacing w:after="40"/>
+            </w:pPr>
+            <w:r>
+              <w:rPr>
+                <w:rFonts w:ascii="Calibri" w:cs="Calibri" w:eastAsia="Calibri" w:hAnsi="Calibri"/>
+                <w:b/>
+                <w:bCs/>
+                <w:sz w:val="17"/>
+                <w:szCs w:val="17"/>
+              </w:rPr>
+              <w:t xml:space="preserve">Democracy:</w:t>
+            </w:r>
+            <w:r>
+              <w:rPr>
+                <w:rFonts w:ascii="Calibri" w:cs="Calibri" w:eastAsia="Calibri" w:hAnsi="Calibri"/>
+                <w:sz w:val="17"/>
+                <w:szCs w:val="17"/>
+              </w:rPr>
+              <w:t xml:space="preserve"> the original vehicle for private-sector involvement in democratic change. Current activity not confirmed.</w:t>
+            </w:r>
+          </w:p>
+        </w:tc>
+        <w:tc>
+          <w:tcPr>
+            <w:tcW w:type="dxa" w:w="2000"/>
+            <w:shd w:fill="EAF1F8" w:color="auto" w:val="clear"/>
+            <w:tcMar>
+              <w:top w:type="dxa" w:w="60"/>
+              <w:left w:type="dxa" w:w="90"/>
+              <w:bottom w:type="dxa" w:w="60"/>
+              <w:right w:type="dxa" w:w="90"/>
+            </w:tcMar>
+          </w:tcPr>
+          <w:p>
+            <w:pPr>
+              <w:spacing w:after="40"/>
+            </w:pPr>
+            <w:r>
+              <w:rPr>
+                <w:rFonts w:ascii="Calibri" w:cs="Calibri" w:eastAsia="Calibri" w:hAnsi="Calibri"/>
+                <w:sz w:val="17"/>
+                <w:szCs w:val="17"/>
+              </w:rPr>
+              <w:t xml:space="preserve">✅ (2018) / ⚠️ current status</w:t>
             </w:r>
           </w:p>
         </w:tc>
@@ -12320,7 +13822,25 @@
           <w:sz w:val="20"/>
           <w:szCs w:val="20"/>
         </w:rPr>
-        <w:t xml:space="preserve">Current status of COSEP (Nicaragua)</w:t>
+        <w:t xml:space="preserve">Current activity of the U.S.-Cuba Business Council and Alianza Cívica</w:t>
+      </w:r>
+    </w:p>
+    <w:p>
+      <w:pPr>
+        <w:pStyle w:val="ListParagraph"/>
+        <w:numPr>
+          <w:ilvl w:val="0"/>
+          <w:numId w:val="2"/>
+        </w:numPr>
+        <w:spacing w:after="40"/>
+      </w:pPr>
+      <w:r>
+        <w:rPr>
+          <w:rFonts w:ascii="Calibri" w:cs="Calibri" w:eastAsia="Calibri" w:hAnsi="Calibri"/>
+          <w:sz w:val="20"/>
+          <w:szCs w:val="20"/>
+        </w:rPr>
+        <w:t xml:space="preserve">Whether former COSEP leaders have formed a Nicaraguan business association in exile</w:t>
       </w:r>
     </w:p>
     <w:p>
@@ -12345,7 +13865,406 @@
         </w:numPr>
         <w:spacing w:after="30"/>
       </w:pPr>
-      <w:hyperlink w:history="1" r:id="rIdjzv3i4eo7oxvc08rkbvy7">
+      <w:hyperlink w:history="1" r:id="rIdku5e2dgwvkkofly-aooxy">
+        <w:r>
+          <w:rPr>
+            <w:rStyle w:val="Hyperlink"/>
+            <w:rFonts w:ascii="Calibri" w:cs="Calibri" w:eastAsia="Calibri" w:hAnsi="Calibri"/>
+            <w:sz w:val="18"/>
+            <w:szCs w:val="18"/>
+          </w:rPr>
+          <w:t xml:space="preserve">Venezuelan American Chamber of Commerce – new board (2026)</w:t>
+        </w:r>
+      </w:hyperlink>
+    </w:p>
+    <w:p>
+      <w:pPr>
+        <w:pStyle w:val="ListParagraph"/>
+        <w:numPr>
+          <w:ilvl w:val="0"/>
+          <w:numId w:val="2"/>
+        </w:numPr>
+        <w:spacing w:after="30"/>
+      </w:pPr>
+      <w:hyperlink w:history="1" r:id="rIdqcskl0bfabxj6ocv1zhdc">
+        <w:r>
+          <w:rPr>
+            <w:rStyle w:val="Hyperlink"/>
+            <w:rFonts w:ascii="Calibri" w:cs="Calibri" w:eastAsia="Calibri" w:hAnsi="Calibri"/>
+            <w:sz w:val="18"/>
+            <w:szCs w:val="18"/>
+          </w:rPr>
+          <w:t xml:space="preserve">VZ Economics – Venezuelan-American Chamber of Commerce</w:t>
+        </w:r>
+      </w:hyperlink>
+    </w:p>
+    <w:p>
+      <w:pPr>
+        <w:pStyle w:val="ListParagraph"/>
+        <w:numPr>
+          <w:ilvl w:val="0"/>
+          <w:numId w:val="2"/>
+        </w:numPr>
+        <w:spacing w:after="30"/>
+      </w:pPr>
+      <w:hyperlink w:history="1" r:id="rIdscleymjzughazdn1bw4do">
+        <w:r>
+          <w:rPr>
+            <w:rStyle w:val="Hyperlink"/>
+            <w:rFonts w:ascii="Calibri" w:cs="Calibri" w:eastAsia="Calibri" w:hAnsi="Calibri"/>
+            <w:sz w:val="18"/>
+            <w:szCs w:val="18"/>
+          </w:rPr>
+          <w:t xml:space="preserve">NTN24 – Fedecámaras seeks alliance with diaspora entrepreneurs</w:t>
+        </w:r>
+      </w:hyperlink>
+    </w:p>
+    <w:p>
+      <w:pPr>
+        <w:pStyle w:val="ListParagraph"/>
+        <w:numPr>
+          <w:ilvl w:val="0"/>
+          <w:numId w:val="2"/>
+        </w:numPr>
+        <w:spacing w:after="30"/>
+      </w:pPr>
+      <w:hyperlink w:history="1" r:id="rId4mvedhokoyonbhrifw4jt">
+        <w:r>
+          <w:rPr>
+            <w:rStyle w:val="Hyperlink"/>
+            <w:rFonts w:ascii="Calibri" w:cs="Calibri" w:eastAsia="Calibri" w:hAnsi="Calibri"/>
+            <w:sz w:val="18"/>
+            <w:szCs w:val="18"/>
+          </w:rPr>
+          <w:t xml:space="preserve">Fedecámaras – Carta de Valencia (Dec 2025)</w:t>
+        </w:r>
+      </w:hyperlink>
+    </w:p>
+    <w:p>
+      <w:pPr>
+        <w:pStyle w:val="ListParagraph"/>
+        <w:numPr>
+          <w:ilvl w:val="0"/>
+          <w:numId w:val="2"/>
+        </w:numPr>
+        <w:spacing w:after="30"/>
+      </w:pPr>
+      <w:hyperlink w:history="1" r:id="rId3yaxhimdxv3lnpptppqur">
+        <w:r>
+          <w:rPr>
+            <w:rStyle w:val="Hyperlink"/>
+            <w:rFonts w:ascii="Calibri" w:cs="Calibri" w:eastAsia="Calibri" w:hAnsi="Calibri"/>
+            <w:sz w:val="18"/>
+            <w:szCs w:val="18"/>
+          </w:rPr>
+          <w:t xml:space="preserve">El Diario – Fedecámaras presents opportunities to German firms (Jun 2026)</w:t>
+        </w:r>
+      </w:hyperlink>
+    </w:p>
+    <w:p>
+      <w:pPr>
+        <w:pStyle w:val="ListParagraph"/>
+        <w:numPr>
+          <w:ilvl w:val="0"/>
+          <w:numId w:val="2"/>
+        </w:numPr>
+        <w:spacing w:after="30"/>
+      </w:pPr>
+      <w:hyperlink w:history="1" r:id="rIddy1v1xrtglujnrvu4shhf">
+        <w:r>
+          <w:rPr>
+            <w:rStyle w:val="Hyperlink"/>
+            <w:rFonts w:ascii="Calibri" w:cs="Calibri" w:eastAsia="Calibri" w:hAnsi="Calibri"/>
+            <w:sz w:val="18"/>
+            <w:szCs w:val="18"/>
+          </w:rPr>
+          <w:t xml:space="preserve">El Diario – Conindustria Q1 2026 manufacturing growth</w:t>
+        </w:r>
+      </w:hyperlink>
+    </w:p>
+    <w:p>
+      <w:pPr>
+        <w:pStyle w:val="ListParagraph"/>
+        <w:numPr>
+          <w:ilvl w:val="0"/>
+          <w:numId w:val="2"/>
+        </w:numPr>
+        <w:spacing w:after="30"/>
+      </w:pPr>
+      <w:hyperlink w:history="1" r:id="rIdpmqvpemdhgwrcqfwswzd6">
+        <w:r>
+          <w:rPr>
+            <w:rStyle w:val="Hyperlink"/>
+            <w:rFonts w:ascii="Calibri" w:cs="Calibri" w:eastAsia="Calibri" w:hAnsi="Calibri"/>
+            <w:sz w:val="18"/>
+            <w:szCs w:val="18"/>
+          </w:rPr>
+          <w:t xml:space="preserve">S-RM – Venezuela in a post-Maduro world (Apr 2026)</w:t>
+        </w:r>
+      </w:hyperlink>
+    </w:p>
+    <w:p>
+      <w:pPr>
+        <w:pStyle w:val="ListParagraph"/>
+        <w:numPr>
+          <w:ilvl w:val="0"/>
+          <w:numId w:val="2"/>
+        </w:numPr>
+        <w:spacing w:after="30"/>
+      </w:pPr>
+      <w:hyperlink w:history="1" r:id="rIdzgwelxi1zhuivpdb8ol6v">
+        <w:r>
+          <w:rPr>
+            <w:rStyle w:val="Hyperlink"/>
+            <w:rFonts w:ascii="Calibri" w:cs="Calibri" w:eastAsia="Calibri" w:hAnsi="Calibri"/>
+            <w:sz w:val="18"/>
+            <w:szCs w:val="18"/>
+          </w:rPr>
+          <w:t xml:space="preserve">CiberCuba – Exiled Cubans create a chamber of commerce (Jun 2026)</w:t>
+        </w:r>
+      </w:hyperlink>
+    </w:p>
+    <w:p>
+      <w:pPr>
+        <w:pStyle w:val="ListParagraph"/>
+        <w:numPr>
+          <w:ilvl w:val="0"/>
+          <w:numId w:val="2"/>
+        </w:numPr>
+        <w:spacing w:after="30"/>
+      </w:pPr>
+      <w:hyperlink w:history="1" r:id="rIdangg0uri2c6tc0ujhjwuz">
+        <w:r>
+          <w:rPr>
+            <w:rStyle w:val="Hyperlink"/>
+            <w:rFonts w:ascii="Calibri" w:cs="Calibri" w:eastAsia="Calibri" w:hAnsi="Calibri"/>
+            <w:sz w:val="18"/>
+            <w:szCs w:val="18"/>
+          </w:rPr>
+          <w:t xml:space="preserve">Latin Times – Cuban entrepreneurs ready to invest, but the embargo says not yet</w:t>
+        </w:r>
+      </w:hyperlink>
+    </w:p>
+    <w:p>
+      <w:pPr>
+        <w:pStyle w:val="ListParagraph"/>
+        <w:numPr>
+          <w:ilvl w:val="0"/>
+          <w:numId w:val="2"/>
+        </w:numPr>
+        <w:spacing w:after="30"/>
+      </w:pPr>
+      <w:hyperlink w:history="1" r:id="rIdajes4bfbmbnntf6w99lj4">
+        <w:r>
+          <w:rPr>
+            <w:rStyle w:val="Hyperlink"/>
+            <w:rFonts w:ascii="Calibri" w:cs="Calibri" w:eastAsia="Calibri" w:hAnsi="Calibri"/>
+            <w:sz w:val="18"/>
+            <w:szCs w:val="18"/>
+          </w:rPr>
+          <w:t xml:space="preserve">Cuba Study Group – Carlos A. Saladrigas</w:t>
+        </w:r>
+      </w:hyperlink>
+    </w:p>
+    <w:p>
+      <w:pPr>
+        <w:pStyle w:val="ListParagraph"/>
+        <w:numPr>
+          <w:ilvl w:val="0"/>
+          <w:numId w:val="2"/>
+        </w:numPr>
+        <w:spacing w:after="30"/>
+      </w:pPr>
+      <w:hyperlink w:history="1" r:id="rIdxfljjbtea1vu8tw9bewa3">
+        <w:r>
+          <w:rPr>
+            <w:rStyle w:val="Hyperlink"/>
+            <w:rFonts w:ascii="Calibri" w:cs="Calibri" w:eastAsia="Calibri" w:hAnsi="Calibri"/>
+            <w:sz w:val="18"/>
+            <w:szCs w:val="18"/>
+          </w:rPr>
+          <w:t xml:space="preserve">Inter-American Dialogue – Interview with Carlos Saladrigas (2021)</w:t>
+        </w:r>
+      </w:hyperlink>
+    </w:p>
+    <w:p>
+      <w:pPr>
+        <w:pStyle w:val="ListParagraph"/>
+        <w:numPr>
+          <w:ilvl w:val="0"/>
+          <w:numId w:val="2"/>
+        </w:numPr>
+        <w:spacing w:after="30"/>
+      </w:pPr>
+      <w:hyperlink w:history="1" r:id="rIdnsk2pzjq-efnohquseeuo">
+        <w:r>
+          <w:rPr>
+            <w:rStyle w:val="Hyperlink"/>
+            <w:rFonts w:ascii="Calibri" w:cs="Calibri" w:eastAsia="Calibri" w:hAnsi="Calibri"/>
+            <w:sz w:val="18"/>
+            <w:szCs w:val="18"/>
+          </w:rPr>
+          <w:t xml:space="preserve">Cubanet – Critique of the Cuba Study Group</w:t>
+        </w:r>
+      </w:hyperlink>
+    </w:p>
+    <w:p>
+      <w:pPr>
+        <w:pStyle w:val="ListParagraph"/>
+        <w:numPr>
+          <w:ilvl w:val="0"/>
+          <w:numId w:val="2"/>
+        </w:numPr>
+        <w:spacing w:after="30"/>
+      </w:pPr>
+      <w:hyperlink w:history="1" r:id="rId2i7lw0hjntxgvfocq_z_s">
+        <w:r>
+          <w:rPr>
+            <w:rStyle w:val="Hyperlink"/>
+            <w:rFonts w:ascii="Calibri" w:cs="Calibri" w:eastAsia="Calibri" w:hAnsi="Calibri"/>
+            <w:sz w:val="18"/>
+            <w:szCs w:val="18"/>
+          </w:rPr>
+          <w:t xml:space="preserve">U.S. Chamber – U.S.-Cuba Business Council</w:t>
+        </w:r>
+      </w:hyperlink>
+    </w:p>
+    <w:p>
+      <w:pPr>
+        <w:pStyle w:val="ListParagraph"/>
+        <w:numPr>
+          <w:ilvl w:val="0"/>
+          <w:numId w:val="2"/>
+        </w:numPr>
+        <w:spacing w:after="30"/>
+      </w:pPr>
+      <w:hyperlink w:history="1" r:id="rId9tg0z20xi5z8ffhfklynp">
+        <w:r>
+          <w:rPr>
+            <w:rStyle w:val="Hyperlink"/>
+            <w:rFonts w:ascii="Calibri" w:cs="Calibri" w:eastAsia="Calibri" w:hAnsi="Calibri"/>
+            <w:sz w:val="18"/>
+            <w:szCs w:val="18"/>
+          </w:rPr>
+          <w:t xml:space="preserve">Al Jazeera – Cuba's power grid collapses again (Jul 2026)</w:t>
+        </w:r>
+      </w:hyperlink>
+    </w:p>
+    <w:p>
+      <w:pPr>
+        <w:pStyle w:val="ListParagraph"/>
+        <w:numPr>
+          <w:ilvl w:val="0"/>
+          <w:numId w:val="2"/>
+        </w:numPr>
+        <w:spacing w:after="30"/>
+      </w:pPr>
+      <w:hyperlink w:history="1" r:id="rIdufbdfal5hj2ah7utbd4j7">
+        <w:r>
+          <w:rPr>
+            <w:rStyle w:val="Hyperlink"/>
+            <w:rFonts w:ascii="Calibri" w:cs="Calibri" w:eastAsia="Calibri" w:hAnsi="Calibri"/>
+            <w:sz w:val="18"/>
+            <w:szCs w:val="18"/>
+          </w:rPr>
+          <w:t xml:space="preserve">U.S. State Department – 2026 Investment Climate Statement: Nicaragua</w:t>
+        </w:r>
+      </w:hyperlink>
+    </w:p>
+    <w:p>
+      <w:pPr>
+        <w:pStyle w:val="ListParagraph"/>
+        <w:numPr>
+          <w:ilvl w:val="0"/>
+          <w:numId w:val="2"/>
+        </w:numPr>
+        <w:spacing w:after="30"/>
+      </w:pPr>
+      <w:hyperlink w:history="1" r:id="rIdpl4zl5ghfohu569-yyb0-">
+        <w:r>
+          <w:rPr>
+            <w:rStyle w:val="Hyperlink"/>
+            <w:rFonts w:ascii="Calibri" w:cs="Calibri" w:eastAsia="Calibri" w:hAnsi="Calibri"/>
+            <w:sz w:val="18"/>
+            <w:szCs w:val="18"/>
+          </w:rPr>
+          <w:t xml:space="preserve">Havana Times – Ortega closes down Nicaragua's main business organizations</w:t>
+        </w:r>
+      </w:hyperlink>
+    </w:p>
+    <w:p>
+      <w:pPr>
+        <w:pStyle w:val="ListParagraph"/>
+        <w:numPr>
+          <w:ilvl w:val="0"/>
+          <w:numId w:val="2"/>
+        </w:numPr>
+        <w:spacing w:after="30"/>
+      </w:pPr>
+      <w:hyperlink w:history="1" r:id="rIdf9u0jfp9ro-szwayfnvpx">
+        <w:r>
+          <w:rPr>
+            <w:rStyle w:val="Hyperlink"/>
+            <w:rFonts w:ascii="Calibri" w:cs="Calibri" w:eastAsia="Calibri" w:hAnsi="Calibri"/>
+            <w:sz w:val="18"/>
+            <w:szCs w:val="18"/>
+          </w:rPr>
+          <w:t xml:space="preserve">Expediente Público – Nicaraguan business leaders between Ortega and the wall</w:t>
+        </w:r>
+      </w:hyperlink>
+    </w:p>
+    <w:p>
+      <w:pPr>
+        <w:pStyle w:val="ListParagraph"/>
+        <w:numPr>
+          <w:ilvl w:val="0"/>
+          <w:numId w:val="2"/>
+        </w:numPr>
+        <w:spacing w:after="30"/>
+      </w:pPr>
+      <w:hyperlink w:history="1" r:id="rIdvfjqszzgzy8groqeandn_">
+        <w:r>
+          <w:rPr>
+            <w:rStyle w:val="Hyperlink"/>
+            <w:rFonts w:ascii="Calibri" w:cs="Calibri" w:eastAsia="Calibri" w:hAnsi="Calibri"/>
+            <w:sz w:val="18"/>
+            <w:szCs w:val="18"/>
+          </w:rPr>
+          <w:t xml:space="preserve">Artículo 66 – Exiles call on the OAS not to forget Nicaragua (May 2026)</w:t>
+        </w:r>
+      </w:hyperlink>
+    </w:p>
+    <w:p>
+      <w:pPr>
+        <w:pStyle w:val="ListParagraph"/>
+        <w:numPr>
+          <w:ilvl w:val="0"/>
+          <w:numId w:val="2"/>
+        </w:numPr>
+        <w:spacing w:after="30"/>
+      </w:pPr>
+      <w:hyperlink w:history="1" r:id="rIdhceupuoagdyomrbxiphbr">
+        <w:r>
+          <w:rPr>
+            <w:rStyle w:val="Hyperlink"/>
+            <w:rFonts w:ascii="Calibri" w:cs="Calibri" w:eastAsia="Calibri" w:hAnsi="Calibri"/>
+            <w:sz w:val="18"/>
+            <w:szCs w:val="18"/>
+          </w:rPr>
+          <w:t xml:space="preserve">Revista EyN – AmCham Nicaragua (2016)</w:t>
+        </w:r>
+      </w:hyperlink>
+    </w:p>
+    <w:p>
+      <w:pPr>
+        <w:pStyle w:val="ListParagraph"/>
+        <w:numPr>
+          <w:ilvl w:val="0"/>
+          <w:numId w:val="2"/>
+        </w:numPr>
+        <w:spacing w:after="30"/>
+      </w:pPr>
+      <w:hyperlink w:history="1" r:id="rIdbblu_ils0auzgejfw2ptx">
         <w:r>
           <w:rPr>
             <w:rStyle w:val="Hyperlink"/>
@@ -12366,7 +14285,7 @@
         </w:numPr>
         <w:spacing w:after="30"/>
       </w:pPr>
-      <w:hyperlink w:history="1" r:id="rIdo3ophd_fctvmyidqyjrs4">
+      <w:hyperlink w:history="1" r:id="rIdjlptyprjoj_sjr30-ktx-">
         <w:r>
           <w:rPr>
             <w:rStyle w:val="Hyperlink"/>
@@ -12387,7 +14306,7 @@
         </w:numPr>
         <w:spacing w:after="30"/>
       </w:pPr>
-      <w:hyperlink w:history="1" r:id="rIdoy-yloypsotwd25xcnmn3">
+      <w:hyperlink w:history="1" r:id="rIduztnpjjyee6gam7pnnurx">
         <w:r>
           <w:rPr>
             <w:rStyle w:val="Hyperlink"/>
@@ -12408,7 +14327,7 @@
         </w:numPr>
         <w:spacing w:after="30"/>
       </w:pPr>
-      <w:hyperlink w:history="1" r:id="rIdmla5nzdc0rysbo0jdypqp">
+      <w:hyperlink w:history="1" r:id="rIdaod_wlvyqbwq4g4338tug">
         <w:r>
           <w:rPr>
             <w:rStyle w:val="Hyperlink"/>
@@ -12429,7 +14348,7 @@
         </w:numPr>
         <w:spacing w:after="30"/>
       </w:pPr>
-      <w:hyperlink w:history="1" r:id="rIdkfcm_w_ruang_hopnj_ii">
+      <w:hyperlink w:history="1" r:id="rIdf60phpnfmr1yjj5wqkc0z">
         <w:r>
           <w:rPr>
             <w:rStyle w:val="Hyperlink"/>
@@ -12450,7 +14369,7 @@
         </w:numPr>
         <w:spacing w:after="30"/>
       </w:pPr>
-      <w:hyperlink w:history="1" r:id="rIdr6y1taiwvnprwc9qa8wci">
+      <w:hyperlink w:history="1" r:id="rIdyckz2tpzf4c52yikast3j">
         <w:r>
           <w:rPr>
             <w:rStyle w:val="Hyperlink"/>
@@ -12471,7 +14390,7 @@
         </w:numPr>
         <w:spacing w:after="30"/>
       </w:pPr>
-      <w:hyperlink w:history="1" r:id="rIdkm6hkodgbpl5zkjd3ynhz">
+      <w:hyperlink w:history="1" r:id="rIdffwgmlmbgmncsqxjvjqxm">
         <w:r>
           <w:rPr>
             <w:rStyle w:val="Hyperlink"/>
@@ -12492,7 +14411,7 @@
         </w:numPr>
         <w:spacing w:after="30"/>
       </w:pPr>
-      <w:hyperlink w:history="1" r:id="rIdvlybccpc3rkmt9pnbmshm">
+      <w:hyperlink w:history="1" r:id="rIdayalxo-dipujq8eg6-nn4">
         <w:r>
           <w:rPr>
             <w:rStyle w:val="Hyperlink"/>
@@ -12513,7 +14432,7 @@
         </w:numPr>
         <w:spacing w:after="30"/>
       </w:pPr>
-      <w:hyperlink w:history="1" r:id="rIdzhbwwgiyme7tjm4xbwrla">
+      <w:hyperlink w:history="1" r:id="rIdb0_vplr0qdwq80zh_6pk1">
         <w:r>
           <w:rPr>
             <w:rStyle w:val="Hyperlink"/>
@@ -12534,7 +14453,7 @@
         </w:numPr>
         <w:spacing w:after="30"/>
       </w:pPr>
-      <w:hyperlink w:history="1" r:id="rIdhh8jjhbi5usvwwr03pehb">
+      <w:hyperlink w:history="1" r:id="rIdlbrdulcrwhh5ygecxdlxo">
         <w:r>
           <w:rPr>
             <w:rStyle w:val="Hyperlink"/>
@@ -12555,7 +14474,7 @@
         </w:numPr>
         <w:spacing w:after="30"/>
       </w:pPr>
-      <w:hyperlink w:history="1" r:id="rIdxhmr9kozormd8dk-zyhnm">
+      <w:hyperlink w:history="1" r:id="rIdlgfamynso9o-vkxqbhbtv">
         <w:r>
           <w:rPr>
             <w:rStyle w:val="Hyperlink"/>
@@ -12576,7 +14495,7 @@
         </w:numPr>
         <w:spacing w:after="30"/>
       </w:pPr>
-      <w:hyperlink w:history="1" r:id="rIdvtwv19lnpwmfkltvft-pn">
+      <w:hyperlink w:history="1" r:id="rIdxh952xw0nusa6mfmkq2w9">
         <w:r>
           <w:rPr>
             <w:rStyle w:val="Hyperlink"/>
@@ -12597,7 +14516,7 @@
         </w:numPr>
         <w:spacing w:after="30"/>
       </w:pPr>
-      <w:hyperlink w:history="1" r:id="rIdmpd1giodfoq4pd4mqw2ex">
+      <w:hyperlink w:history="1" r:id="rId_csewzzfxpbczjdnyh1o8">
         <w:r>
           <w:rPr>
             <w:rStyle w:val="Hyperlink"/>
@@ -12618,7 +14537,7 @@
         </w:numPr>
         <w:spacing w:after="30"/>
       </w:pPr>
-      <w:hyperlink w:history="1" r:id="rIdo5t_sy-hjj7dhsvt35l29">
+      <w:hyperlink w:history="1" r:id="rIdzrhyf120dy9udn7nfv0ie">
         <w:r>
           <w:rPr>
             <w:rStyle w:val="Hyperlink"/>
@@ -12639,7 +14558,7 @@
         </w:numPr>
         <w:spacing w:after="30"/>
       </w:pPr>
-      <w:hyperlink w:history="1" r:id="rIdjgnv1z9cz9iwnaxym0z_z">
+      <w:hyperlink w:history="1" r:id="rIdqhvsbgth14h8xmzpxrup5">
         <w:r>
           <w:rPr>
             <w:rStyle w:val="Hyperlink"/>
@@ -12660,7 +14579,7 @@
         </w:numPr>
         <w:spacing w:after="30"/>
       </w:pPr>
-      <w:hyperlink w:history="1" r:id="rIdnetk44ogvn8anwvcbgr-w">
+      <w:hyperlink w:history="1" r:id="rIdpjysehcnwvhdely8klxss">
         <w:r>
           <w:rPr>
             <w:rStyle w:val="Hyperlink"/>
@@ -12681,7 +14600,7 @@
         </w:numPr>
         <w:spacing w:after="30"/>
       </w:pPr>
-      <w:hyperlink w:history="1" r:id="rIddvxbgluk23kbvz--aom2k">
+      <w:hyperlink w:history="1" r:id="rIducu-btu9ywiotqnr-0x4h">
         <w:r>
           <w:rPr>
             <w:rStyle w:val="Hyperlink"/>
@@ -12702,7 +14621,7 @@
         </w:numPr>
         <w:spacing w:after="30"/>
       </w:pPr>
-      <w:hyperlink w:history="1" r:id="rIdlybon2sebz5gg48gpcpxj">
+      <w:hyperlink w:history="1" r:id="rId7dku2hhasnl4ypzzqhxyl">
         <w:r>
           <w:rPr>
             <w:rStyle w:val="Hyperlink"/>
@@ -12723,7 +14642,7 @@
         </w:numPr>
         <w:spacing w:after="30"/>
       </w:pPr>
-      <w:hyperlink w:history="1" r:id="rIdohbhvaes4awzymdwztqoh">
+      <w:hyperlink w:history="1" r:id="rIdyoj8uyfzjifmkddjbhtvw">
         <w:r>
           <w:rPr>
             <w:rStyle w:val="Hyperlink"/>
@@ -12744,7 +14663,7 @@
         </w:numPr>
         <w:spacing w:after="30"/>
       </w:pPr>
-      <w:hyperlink w:history="1" r:id="rIdd_zkkmmswmvidp1ymzz1t">
+      <w:hyperlink w:history="1" r:id="rIdkz1thlujpwnmbly3faxfm">
         <w:r>
           <w:rPr>
             <w:rStyle w:val="Hyperlink"/>
@@ -12765,7 +14684,7 @@
         </w:numPr>
         <w:spacing w:after="30"/>
       </w:pPr>
-      <w:hyperlink w:history="1" r:id="rIdtae5ljra6qp4wiahmdu7x">
+      <w:hyperlink w:history="1" r:id="rIdmkbx2gfzfxxzeru5k7chv">
         <w:r>
           <w:rPr>
             <w:rStyle w:val="Hyperlink"/>
@@ -12786,7 +14705,7 @@
         </w:numPr>
         <w:spacing w:after="30"/>
       </w:pPr>
-      <w:hyperlink w:history="1" r:id="rIdnhsfkwe-u2mprsjolx93m">
+      <w:hyperlink w:history="1" r:id="rIdgfg1ruexwsod0ewrkj62r">
         <w:r>
           <w:rPr>
             <w:rStyle w:val="Hyperlink"/>
@@ -12807,7 +14726,7 @@
         </w:numPr>
         <w:spacing w:after="30"/>
       </w:pPr>
-      <w:hyperlink w:history="1" r:id="rIdrkqcxmdi4kyww_gyzp2r8">
+      <w:hyperlink w:history="1" r:id="rIdv8gjh0znqieicnvspe_uo">
         <w:r>
           <w:rPr>
             <w:rStyle w:val="Hyperlink"/>
@@ -12828,7 +14747,7 @@
         </w:numPr>
         <w:spacing w:after="30"/>
       </w:pPr>
-      <w:hyperlink w:history="1" r:id="rIdpy6xnuo_fm4ki1i-qo1gz">
+      <w:hyperlink w:history="1" r:id="rIdbyzrxhunnev4k9douphu8">
         <w:r>
           <w:rPr>
             <w:rStyle w:val="Hyperlink"/>
@@ -12849,7 +14768,7 @@
         </w:numPr>
         <w:spacing w:after="30"/>
       </w:pPr>
-      <w:hyperlink w:history="1" r:id="rIdukvidglczvwvo_a-rlu8b">
+      <w:hyperlink w:history="1" r:id="rIdzy_b9ejacf447kgwwsdfy">
         <w:r>
           <w:rPr>
             <w:rStyle w:val="Hyperlink"/>
@@ -12870,7 +14789,7 @@
         </w:numPr>
         <w:spacing w:after="30"/>
       </w:pPr>
-      <w:hyperlink w:history="1" r:id="rIdoudnl203hwjhnizaqssuq">
+      <w:hyperlink w:history="1" r:id="rIdxqeyvqu69ov5pojxc9ctc">
         <w:r>
           <w:rPr>
             <w:rStyle w:val="Hyperlink"/>
@@ -12891,7 +14810,7 @@
         </w:numPr>
         <w:spacing w:after="30"/>
       </w:pPr>
-      <w:hyperlink w:history="1" r:id="rIdwbn45uow1knrcfa9ipbi4">
+      <w:hyperlink w:history="1" r:id="rIdbwv48iswa76rcxuvdvf8g">
         <w:r>
           <w:rPr>
             <w:rStyle w:val="Hyperlink"/>

</xml_diff>